<commit_message>
Fully updated lighting recommendations to match 2026 LED template meeting
</commit_message>
<xml_diff>
--- a/Lighting/Install Motion Sensor/template 1.docx
+++ b/Lighting/Install Motion Sensor/template 1.docx
@@ -260,19 +260,7 @@
               <w:rPr>
                 <w:bCs/>
               </w:rPr>
-              <w:t>${</w:t>
-            </w:r>
-            <w:r>
-              <w:rPr>
-                <w:bCs/>
-              </w:rPr>
-              <w:t>M</w:t>
-            </w:r>
-            <w:r>
-              <w:rPr>
-                <w:bCs/>
-              </w:rPr>
-              <w:t>IC}</w:t>
+              <w:t>${IC}</w:t>
             </w:r>
           </w:p>
         </w:tc>
@@ -313,19 +301,7 @@
               <w:rPr>
                 <w:bCs/>
               </w:rPr>
-              <w:t>${</w:t>
-            </w:r>
-            <w:r>
-              <w:rPr>
-                <w:bCs/>
-              </w:rPr>
-              <w:t>M</w:t>
-            </w:r>
-            <w:r>
-              <w:rPr>
-                <w:bCs/>
-              </w:rPr>
-              <w:t>PB}</w:t>
+              <w:t>${PB}</w:t>
             </w:r>
           </w:p>
         </w:tc>
@@ -380,6 +356,40 @@
                 <w:bCs/>
               </w:rPr>
               <w:t>kWh</w:t>
+            </w:r>
+          </w:p>
+        </w:tc>
+      </w:tr>
+      <w:tr>
+        <w:trPr>
+          <w:trHeight w:val="352"/>
+          <w:jc w:val="center"/>
+        </w:trPr>
+        <w:tc>
+          <w:tcPr>
+            <w:tcW w:w="2955" w:type="dxa"/>
+            <w:vAlign w:val="center"/>
+          </w:tcPr>
+          <w:p>
+            <w:pPr>
+              <w:spacing w:before="60" w:after="60"/>
+            </w:pPr>
+            <w:r>
+              <w:t>Annual Demand Savings</w:t>
+            </w:r>
+          </w:p>
+        </w:tc>
+        <w:tc>
+          <w:tcPr>
+            <w:tcW w:w="2160" w:type="dxa"/>
+            <w:vAlign w:val="center"/>
+          </w:tcPr>
+          <w:p>
+            <w:pPr>
+              <w:spacing w:before="60" w:after="60"/>
+            </w:pPr>
+            <w:r>
+              <w:t>${DS} kW</w:t>
             </w:r>
           </w:p>
         </w:tc>

</xml_diff>